<commit_message>
update to complete draft assignment
</commit_message>
<xml_diff>
--- a/_site/slides/CompleteDraft_m58_s26_Islands.docx
+++ b/_site/slides/CompleteDraft_m58_s26_Islands.docx
@@ -1420,7 +1420,7 @@
           <w:sz w:val="22"/>
           <w:szCs w:val="22"/>
         </w:rPr>
-        <w:t>A multiple regression model to assess the response variable and research question</w:t>
+        <w:t>Any hypothesis tests that are relevant to your narrative:</w:t>
       </w:r>
     </w:p>
     <w:p>
@@ -1442,7 +1442,7 @@
           <w:sz w:val="22"/>
           <w:szCs w:val="22"/>
         </w:rPr>
-        <w:t>A discussion on the choice of variables to be used in the multiple regression model</w:t>
+        <w:t>A hypothesis test to confirm that your randomization worked (or to show that it didn’t!), and the consequences.</w:t>
       </w:r>
     </w:p>
     <w:p>
@@ -1464,7 +1464,55 @@
           <w:sz w:val="22"/>
           <w:szCs w:val="22"/>
         </w:rPr>
-        <w:t>A prediction of the response variable for a new Islander that you happen to run into (feel free to find one extra sample value!)</w:t>
+        <w:t xml:space="preserve">A hypothesis test to show the initial results of your research question (e.g., maybe a </w:t>
+      </w:r>
+      <w:proofErr w:type="gramStart"/>
+      <w:r>
+        <w:rPr>
+          <w:rFonts w:ascii="Arial" w:hAnsi="Arial" w:cs="Arial"/>
+          <w:sz w:val="22"/>
+          <w:szCs w:val="22"/>
+        </w:rPr>
+        <w:t>two sample</w:t>
+      </w:r>
+      <w:proofErr w:type="gramEnd"/>
+      <w:r>
+        <w:rPr>
+          <w:rFonts w:ascii="Arial" w:hAnsi="Arial" w:cs="Arial"/>
+          <w:sz w:val="22"/>
+          <w:szCs w:val="22"/>
+        </w:rPr>
+        <w:t xml:space="preserve"> t-test)</w:t>
+      </w:r>
+    </w:p>
+    <w:p>
+      <w:pPr>
+        <w:pStyle w:val="ListParagraph"/>
+        <w:numPr>
+          <w:ilvl w:val="0"/>
+          <w:numId w:val="22"/>
+        </w:numPr>
+        <w:rPr>
+          <w:rFonts w:ascii="Arial" w:hAnsi="Arial" w:cs="Arial"/>
+          <w:sz w:val="22"/>
+          <w:szCs w:val="22"/>
+        </w:rPr>
+      </w:pPr>
+      <w:r>
+        <w:rPr>
+          <w:rFonts w:ascii="Arial" w:hAnsi="Arial" w:cs="Arial"/>
+          <w:sz w:val="22"/>
+          <w:szCs w:val="22"/>
+        </w:rPr>
+        <w:t>A multiple regression model to assess the response variable and research question</w:t>
+      </w:r>
+      <w:r>
+        <w:rPr>
+          <w:rFonts w:ascii="Arial" w:hAnsi="Arial" w:cs="Arial"/>
+          <w:sz w:val="22"/>
+          <w:szCs w:val="22"/>
+        </w:rPr>
+        <w:t xml:space="preserve"> more completely</w:t>
       </w:r>
     </w:p>
     <w:p>
@@ -1486,7 +1534,91 @@
           <w:sz w:val="22"/>
           <w:szCs w:val="22"/>
         </w:rPr>
-        <w:t>A discussion of the significance of the variables in the model and of the significance of the treatment variable</w:t>
+        <w:t>A discussion on the choice of variables to be used in the multiple regression model</w:t>
+      </w:r>
+      <w:r>
+        <w:rPr>
+          <w:rFonts w:ascii="Arial" w:hAnsi="Arial" w:cs="Arial"/>
+          <w:sz w:val="22"/>
+          <w:szCs w:val="22"/>
+        </w:rPr>
+        <w:t xml:space="preserve"> (your MLR should include your treatment variable and other variables from the data collection)</w:t>
+      </w:r>
+    </w:p>
+    <w:p>
+      <w:pPr>
+        <w:pStyle w:val="ListParagraph"/>
+        <w:numPr>
+          <w:ilvl w:val="1"/>
+          <w:numId w:val="22"/>
+        </w:numPr>
+        <w:rPr>
+          <w:rFonts w:ascii="Arial" w:hAnsi="Arial" w:cs="Arial"/>
+          <w:sz w:val="22"/>
+          <w:szCs w:val="22"/>
+        </w:rPr>
+      </w:pPr>
+      <w:r>
+        <w:rPr>
+          <w:rFonts w:ascii="Arial" w:hAnsi="Arial" w:cs="Arial"/>
+          <w:sz w:val="22"/>
+          <w:szCs w:val="22"/>
+        </w:rPr>
+        <w:t>A prediction of the response variable for a new Islander that you happen to run into (feel free to find one extra sample value!)</w:t>
+      </w:r>
+    </w:p>
+    <w:p>
+      <w:pPr>
+        <w:pStyle w:val="ListParagraph"/>
+        <w:numPr>
+          <w:ilvl w:val="1"/>
+          <w:numId w:val="22"/>
+        </w:numPr>
+        <w:rPr>
+          <w:rFonts w:ascii="Arial" w:hAnsi="Arial" w:cs="Arial"/>
+          <w:sz w:val="22"/>
+          <w:szCs w:val="22"/>
+        </w:rPr>
+      </w:pPr>
+      <w:r>
+        <w:rPr>
+          <w:rFonts w:ascii="Arial" w:hAnsi="Arial" w:cs="Arial"/>
+          <w:sz w:val="22"/>
+          <w:szCs w:val="22"/>
+        </w:rPr>
+        <w:t xml:space="preserve">A discussion of the </w:t>
+      </w:r>
+      <w:r>
+        <w:rPr>
+          <w:rFonts w:ascii="Arial" w:hAnsi="Arial" w:cs="Arial"/>
+          <w:sz w:val="22"/>
+          <w:szCs w:val="22"/>
+        </w:rPr>
+        <w:t>discernibility</w:t>
+      </w:r>
+      <w:r>
+        <w:rPr>
+          <w:rFonts w:ascii="Arial" w:hAnsi="Arial" w:cs="Arial"/>
+          <w:sz w:val="22"/>
+          <w:szCs w:val="22"/>
+        </w:rPr>
+        <w:t xml:space="preserve"> of the variables in the model and of the </w:t>
+      </w:r>
+      <w:r>
+        <w:rPr>
+          <w:rFonts w:ascii="Arial" w:hAnsi="Arial" w:cs="Arial"/>
+          <w:sz w:val="22"/>
+          <w:szCs w:val="22"/>
+        </w:rPr>
+        <w:t>discernibility</w:t>
+      </w:r>
+      <w:r>
+        <w:rPr>
+          <w:rFonts w:ascii="Arial" w:hAnsi="Arial" w:cs="Arial"/>
+          <w:sz w:val="22"/>
+          <w:szCs w:val="22"/>
+        </w:rPr>
+        <w:t xml:space="preserve"> of the treatment variable</w:t>
       </w:r>
     </w:p>
     <w:p>

</xml_diff>